<commit_message>
git link in llm
</commit_message>
<xml_diff>
--- a/docs/LLM Integration Report.docx
+++ b/docs/LLM Integration Report.docx
@@ -710,15 +710,16 @@
                               <w:sdt>
                                 <w:sdtPr>
                                   <w:rPr>
-                                    <w:caps/>
-                                    <w:color w:val="156082" w:themeColor="accent1"/>
-                                    <w:sz w:val="28"/>
-                                    <w:szCs w:val="28"/>
+                                    <w:rStyle w:val="Hyperlink"/>
+                                    <w:rFonts w:eastAsiaTheme="minorHAnsi"/>
+                                    <w:kern w:val="2"/>
+                                    <w:sz w:val="24"/>
+                                    <w:szCs w:val="24"/>
+                                    <w14:ligatures w14:val="standardContextual"/>
                                   </w:rPr>
                                   <w:alias w:val="Subtitle"/>
                                   <w:tag w:val=""/>
                                   <w:id w:val="-1452929454"/>
-                                  <w:showingPlcHdr/>
                                   <w:dataBinding w:prefixMappings="xmlns:ns0='http://purl.org/dc/elements/1.1/' xmlns:ns1='http://schemas.openxmlformats.org/package/2006/metadata/core-properties' " w:xpath="/ns1:coreProperties[1]/ns0:subject[1]" w:storeItemID="{6C3C8BC8-F283-45AE-878A-BAB7291924A1}"/>
                                   <w:text/>
                                 </w:sdtPr>
@@ -734,15 +735,20 @@
                                         <w:szCs w:val="28"/>
                                       </w:rPr>
                                     </w:pPr>
-                                    <w:r>
-                                      <w:rPr>
-                                        <w:caps/>
-                                        <w:color w:val="156082" w:themeColor="accent1"/>
-                                        <w:sz w:val="28"/>
-                                        <w:szCs w:val="28"/>
-                                      </w:rPr>
-                                      <w:t xml:space="preserve">     </w:t>
-                                    </w:r>
+                                    <w:hyperlink r:id="rId6" w:history="1">
+                                      <w:r>
+                                        <w:rPr>
+                                          <w:rStyle w:val="Hyperlink"/>
+                                          <w:rFonts w:eastAsiaTheme="minorHAnsi"/>
+                                          <w:kern w:val="2"/>
+                                          <w:sz w:val="24"/>
+                                          <w:szCs w:val="24"/>
+                                          <w:lang w:val="en-ZA"/>
+                                          <w14:ligatures w14:val="standardContextual"/>
+                                        </w:rPr>
+                                        <w:t>https://github.com/ZaNekoUvU/GADS-7331-POE-Part-2.git</w:t>
+                                      </w:r>
+                                    </w:hyperlink>
                                   </w:p>
                                 </w:sdtContent>
                               </w:sdt>
@@ -812,15 +818,16 @@
                         <w:sdt>
                           <w:sdtPr>
                             <w:rPr>
-                              <w:caps/>
-                              <w:color w:val="156082" w:themeColor="accent1"/>
-                              <w:sz w:val="28"/>
-                              <w:szCs w:val="28"/>
+                              <w:rStyle w:val="Hyperlink"/>
+                              <w:rFonts w:eastAsiaTheme="minorHAnsi"/>
+                              <w:kern w:val="2"/>
+                              <w:sz w:val="24"/>
+                              <w:szCs w:val="24"/>
+                              <w14:ligatures w14:val="standardContextual"/>
                             </w:rPr>
                             <w:alias w:val="Subtitle"/>
                             <w:tag w:val=""/>
                             <w:id w:val="-1452929454"/>
-                            <w:showingPlcHdr/>
                             <w:dataBinding w:prefixMappings="xmlns:ns0='http://purl.org/dc/elements/1.1/' xmlns:ns1='http://schemas.openxmlformats.org/package/2006/metadata/core-properties' " w:xpath="/ns1:coreProperties[1]/ns0:subject[1]" w:storeItemID="{6C3C8BC8-F283-45AE-878A-BAB7291924A1}"/>
                             <w:text/>
                           </w:sdtPr>
@@ -836,15 +843,20 @@
                                   <w:szCs w:val="28"/>
                                 </w:rPr>
                               </w:pPr>
-                              <w:r>
-                                <w:rPr>
-                                  <w:caps/>
-                                  <w:color w:val="156082" w:themeColor="accent1"/>
-                                  <w:sz w:val="28"/>
-                                  <w:szCs w:val="28"/>
-                                </w:rPr>
-                                <w:t xml:space="preserve">     </w:t>
-                              </w:r>
+                              <w:hyperlink r:id="rId7" w:history="1">
+                                <w:r>
+                                  <w:rPr>
+                                    <w:rStyle w:val="Hyperlink"/>
+                                    <w:rFonts w:eastAsiaTheme="minorHAnsi"/>
+                                    <w:kern w:val="2"/>
+                                    <w:sz w:val="24"/>
+                                    <w:szCs w:val="24"/>
+                                    <w:lang w:val="en-ZA"/>
+                                    <w14:ligatures w14:val="standardContextual"/>
+                                  </w:rPr>
+                                  <w:t>https://github.com/ZaNekoUvU/GADS-7331-POE-Part-2.git</w:t>
+                                </w:r>
+                              </w:hyperlink>
                             </w:p>
                           </w:sdtContent>
                         </w:sdt>
@@ -1682,16 +1694,7 @@
         <w:spacing w:line="360" w:lineRule="auto"/>
       </w:pPr>
       <w:r>
-        <w:t>2026/0</w:t>
-      </w:r>
-      <w:r>
-        <w:t>5</w:t>
-      </w:r>
-      <w:r>
-        <w:t>/1</w:t>
-      </w:r>
-      <w:r>
-        <w:t>5</w:t>
+        <w:t>2026/05/15</w:t>
       </w:r>
     </w:p>
     <w:p>
@@ -3108,6 +3111,7 @@
   <w:style w:type="character" w:default="1" w:styleId="DefaultParagraphFont">
     <w:name w:val="Default Paragraph Font"/>
     <w:uiPriority w:val="1"/>
+    <w:semiHidden/>
     <w:unhideWhenUsed/>
   </w:style>
   <w:style w:type="table" w:default="1" w:styleId="TableNormal">
@@ -3453,6 +3457,29 @@
       <w14:ligatures w14:val="none"/>
     </w:rPr>
   </w:style>
+  <w:style w:type="character" w:styleId="Hyperlink">
+    <w:name w:val="Hyperlink"/>
+    <w:basedOn w:val="DefaultParagraphFont"/>
+    <w:uiPriority w:val="99"/>
+    <w:unhideWhenUsed/>
+    <w:rsid w:val="003351CC"/>
+    <w:rPr>
+      <w:color w:val="467886" w:themeColor="hyperlink"/>
+      <w:u w:val="single"/>
+    </w:rPr>
+  </w:style>
+  <w:style w:type="character" w:styleId="UnresolvedMention">
+    <w:name w:val="Unresolved Mention"/>
+    <w:basedOn w:val="DefaultParagraphFont"/>
+    <w:uiPriority w:val="99"/>
+    <w:semiHidden/>
+    <w:unhideWhenUsed/>
+    <w:rsid w:val="003351CC"/>
+    <w:rPr>
+      <w:color w:val="605E5C"/>
+      <w:shd w:val="clear" w:color="auto" w:fill="E1DFDD"/>
+    </w:rPr>
+  </w:style>
 </w:styles>
 </file>
 

</xml_diff>